<commit_message>
Legal review file: friendly tone for a volunteer reviewer
Co-Authored-By: Claude Opus 5.5 <noreply@anthropic.com>
Claude-Session: https://claude.ai/code/session_01JJLAjTXA3xMvGWo6xvhfJo
</commit_message>
<xml_diff>
--- a/docs/legal/WHATS-POPPIN-legal-review.docx
+++ b/docs/legal/WHATS-POPPIN-legal-review.docx
@@ -18,7 +18,7 @@
           <w:szCs w:val="44"/>
           <w:bCs/>
         </w:rPr>
-        <w:t>WHATS POPPIN: מסמכים משפטיים לאישור עורך דין</w:t>
+        <w:t>WHATS POPPIN: המסמכים המשפטיים, לעיון</w:t>
       </w:r>
     </w:p>
     <w:p>
@@ -35,24 +35,59 @@
           <w:rtl w:val="1"/>
           <w:szCs w:val="22"/>
         </w:rPr>
+        <w:t>תודה רבה שהסכמת להציץ במסמכים ולעזור לי. זה עוזר לי מאוד.</w:t>
+      </w:r>
+    </w:p>
+    <w:p>
+      <w:pPr>
+        <w:bidi w:val="1"/>
+        <w:spacing w:after="120"/>
+        <w:jc w:val="right"/>
+      </w:pPr>
+      <w:r>
+        <w:rPr>
+          <w:rFonts w:ascii="Arial" w:hAnsi="Arial" w:cs="Arial"/>
+          <w:b w:val="0"/>
+          <w:sz w:val="22"/>
+          <w:rtl w:val="1"/>
+          <w:szCs w:val="22"/>
+        </w:rPr>
+        <w:t>כאן ריכזתי את הנוסחים המעודכנים (בעברית), בדיוק כפי שהם מופיעים באתר. בסוף יש שלושה נספחים קצרים: השוואה למסמכים של יד2, שבהם נעזרתי כהשראה; כמה שאלות שלא הייתי בטוח לגביהן; ומה עוד מתוכנן להיבנות באתר.</w:t>
+      </w:r>
+    </w:p>
+    <w:p>
+      <w:pPr>
+        <w:bidi w:val="1"/>
+        <w:spacing w:after="120"/>
+        <w:jc w:val="right"/>
+      </w:pPr>
+      <w:r>
+        <w:rPr>
+          <w:rFonts w:ascii="Arial" w:hAnsi="Arial" w:cs="Arial"/>
+          <w:b w:val="0"/>
+          <w:sz w:val="22"/>
+          <w:rtl w:val="1"/>
+          <w:szCs w:val="22"/>
+        </w:rPr>
+        <w:t>כל הערה תתקבל בשמחה, גם קטנה. אין צורך לעבור על הכל. אם יש זמן רק לחלק, הכי חשוב לי הסכם ההתקשרות עם מפרסמים והשאלות שבנספח ב.</w:t>
+      </w:r>
+    </w:p>
+    <w:p>
+      <w:pPr>
+        <w:bidi w:val="1"/>
+        <w:spacing w:after="120"/>
+        <w:jc w:val="right"/>
+      </w:pPr>
+      <w:r>
+        <w:rPr>
+          <w:rFonts w:ascii="Arial" w:hAnsi="Arial" w:cs="Arial"/>
+          <w:b w:val="0"/>
+          <w:color w:val="55585F"/>
+          <w:sz w:val="20"/>
+          <w:rtl w:val="1"/>
+          <w:szCs w:val="20"/>
+        </w:rPr>
         <w:t>המפעיל: איל חדידה, עוסק מס' [להשלים], [כתובת: להשלים] · מייל: trywhatspoppin@gmail.com</w:t>
-      </w:r>
-    </w:p>
-    <w:p>
-      <w:pPr>
-        <w:bidi w:val="1"/>
-        <w:spacing w:after="120"/>
-        <w:jc w:val="right"/>
-      </w:pPr>
-      <w:r>
-        <w:rPr>
-          <w:rFonts w:ascii="Arial" w:hAnsi="Arial" w:cs="Arial"/>
-          <w:b w:val="0"/>
-          <w:sz w:val="22"/>
-          <w:rtl w:val="1"/>
-          <w:szCs w:val="22"/>
-        </w:rPr>
-        <w:t>המסמך כולל את הנוסחים המעודכנים (בעברית) כפי שהם מופיעים באתר, ובסופו שלושה נספחים: השוואה למסמכי יד2, שאלות פתוחות, ומה ייבנה בשלב הבא.</w:t>
       </w:r>
     </w:p>
     <w:p>
@@ -173,7 +208,7 @@
           <w:rtl w:val="1"/>
           <w:szCs w:val="22"/>
         </w:rPr>
-        <w:t>נספח ב: שאלות פתוחות לעורך הדין</w:t>
+        <w:t>נספח ב: שאלות שאשמח לשמוע את דעתך עליהן</w:t>
       </w:r>
     </w:p>
     <w:p>
@@ -9966,7 +10001,7 @@
                 <w:rtl w:val="1"/>
                 <w:szCs w:val="20"/>
               </w:rPr>
-              <w:t>נוסף: הגלישה פתוחה לכולם, חשבון מפרסם מגיל 18 (שאלה לעו"ד)</w:t>
+              <w:t>נוסף: הגלישה פתוחה לכולם, חשבון מפרסם מגיל 18 (שאלה פתוחה)</w:t>
             </w:r>
           </w:p>
         </w:tc>
@@ -11226,7 +11261,7 @@
                 <w:rtl w:val="1"/>
                 <w:szCs w:val="20"/>
               </w:rPr>
-              <w:t>נוסף: רישיון לא בלעדי במקום העברת זכויות (שאלה לעו"ד)</w:t>
+              <w:t>נוסף: רישיון לא בלעדי במקום העברת זכויות (שאלה פתוחה)</w:t>
             </w:r>
           </w:p>
         </w:tc>
@@ -11946,7 +11981,7 @@
                 <w:rtl w:val="1"/>
                 <w:szCs w:val="20"/>
               </w:rPr>
-              <w:t>נוסף (שאלה לעו"ד)</w:t>
+              <w:t>נוסף (שאלה פתוחה)</w:t>
             </w:r>
           </w:p>
         </w:tc>
@@ -12306,7 +12341,7 @@
                 <w:rtl w:val="1"/>
                 <w:szCs w:val="20"/>
               </w:rPr>
-              <w:t>נוסף (התקופות המדויקות: שאלה לעו"ד)</w:t>
+              <w:t>נוסף (התקופות המדויקות: שאלה פתוחה)</w:t>
             </w:r>
           </w:p>
         </w:tc>
@@ -12784,7 +12819,24 @@
           <w:szCs w:val="36"/>
           <w:bCs/>
         </w:rPr>
-        <w:t>נספח ב: שאלות פתוחות לעורך הדין</w:t>
+        <w:t>נספח ב: שאלות שאשמח לשמוע את דעתך עליהן</w:t>
+      </w:r>
+    </w:p>
+    <w:p>
+      <w:pPr>
+        <w:bidi w:val="1"/>
+        <w:spacing w:after="120"/>
+        <w:jc w:val="right"/>
+      </w:pPr>
+      <w:r>
+        <w:rPr>
+          <w:rFonts w:ascii="Arial" w:hAnsi="Arial" w:cs="Arial"/>
+          <w:b w:val="0"/>
+          <w:sz w:val="22"/>
+          <w:rtl w:val="1"/>
+          <w:szCs w:val="22"/>
+        </w:rPr>
+        <w:t>אלה המקומות שבהם לא הייתי בטוח בניסוח. אם חלק מהשאלות דורשות בדיקה מעמיקה, נוכל לדבר עליהן בהמשך.</w:t>
       </w:r>
     </w:p>
     <w:p>

</xml_diff>

<commit_message>
Remove the operator's name from the site until the details are approved
company.json no longer holds a name; the documents read "the operator of WHATS POPPIN"
and the accessibility contact is the site email. The review file marks the missing
details as to be completed and asks whether they must be published.

Co-Authored-By: Claude Opus 5.5 <noreply@anthropic.com>
Claude-Session: https://claude.ai/code/session_01JJLAjTXA3xMvGWo6xvhfJo
</commit_message>
<xml_diff>
--- a/docs/legal/WHATS-POPPIN-legal-review.docx
+++ b/docs/legal/WHATS-POPPIN-legal-review.docx
@@ -87,7 +87,7 @@
           <w:rtl w:val="1"/>
           <w:szCs w:val="20"/>
         </w:rPr>
-        <w:t>המפעיל: איל חדידה, עוסק מס' [להשלים], [כתובת: להשלים] · מייל: trywhatspoppin@gmail.com</w:t>
+        <w:t>המפעיל: [שם המפעיל: להשלים], עוסק מס' [להשלים], [כתובת: להשלים] · מייל: trywhatspoppin@gmail.com</w:t>
       </w:r>
     </w:p>
     <w:p>
@@ -298,7 +298,7 @@
           <w:rtl w:val="1"/>
           <w:szCs w:val="22"/>
         </w:rPr>
-        <w:t>"החברה" / "אנחנו": איל חדידה, המפעיל את WHATS POPPIN.</w:t>
+        <w:t>"החברה" / "אנחנו": המפעיל את WHATS POPPIN.</w:t>
       </w:r>
     </w:p>
     <w:p>
@@ -856,7 +856,7 @@
           <w:rtl w:val="1"/>
           <w:szCs w:val="22"/>
         </w:rPr>
-        <w:t>: איל חדידה, עוסק מס' [להשלים], [כתובת: להשלים], המפעיל את WHATS POPPIN.</w:t>
+        <w:t>: [שם המפעיל: להשלים], עוסק מס' [להשלים], [כתובת: להשלים], המפעיל את WHATS POPPIN.</w:t>
       </w:r>
     </w:p>
     <w:p>
@@ -3272,7 +3272,7 @@
           <w:rtl w:val="1"/>
           <w:szCs w:val="22"/>
         </w:rPr>
-        <w:t>: איל חדידה, עוסק מס' [להשלים], [כתובת: להשלים], המפעיל את WHATS POPPIN.</w:t>
+        <w:t>: [שם המפעיל: להשלים], עוסק מס' [להשלים], [כתובת: להשלים], המפעיל את WHATS POPPIN.</w:t>
       </w:r>
     </w:p>
     <w:p>
@@ -6398,7 +6398,7 @@
           <w:rtl w:val="1"/>
           <w:szCs w:val="22"/>
         </w:rPr>
-        <w:t>: איל חדידה, עוסק מס' [להשלים], [כתובת: להשלים], המפעיל את WHATS POPPIN.</w:t>
+        <w:t>: [שם המפעיל: להשלים], עוסק מס' [להשלים], [כתובת: להשלים], המפעיל את WHATS POPPIN.</w:t>
       </w:r>
     </w:p>
     <w:p>
@@ -8442,7 +8442,7 @@
           <w:rtl w:val="1"/>
           <w:szCs w:val="22"/>
         </w:rPr>
-        <w:t>האחראי על המידע: איל חדידה, עוסק מס' [להשלים], [כתובת: להשלים]. מייל: trywhatspoppin@gmail.com.</w:t>
+        <w:t>האחראי על המידע: [שם המפעיל: להשלים], עוסק מס' [להשלים], [כתובת: להשלים]. מייל: trywhatspoppin@gmail.com.</w:t>
       </w:r>
     </w:p>
     <w:p>
@@ -8793,7 +8793,7 @@
           <w:rtl w:val="1"/>
           <w:szCs w:val="22"/>
         </w:rPr>
-        <w:t>: איל חדידה, עוסק מס' [להשלים], [כתובת: להשלים], המפעיל את WHATS POPPIN.</w:t>
+        <w:t>: [שם המפעיל: להשלים], עוסק מס' [להשלים], [כתובת: להשלים], המפעיל את WHATS POPPIN.</w:t>
       </w:r>
     </w:p>
     <w:p>
@@ -9709,7 +9709,7 @@
           <w:rtl w:val="1"/>
           <w:szCs w:val="22"/>
         </w:rPr>
-        <w:t>רכז הנגישות: איל חדידה. מייל: trywhatspoppin@gmail.com. אפשר לפנות גם בעמוד "צרו קשר".</w:t>
+        <w:t>רכז הנגישות: [שם רכז הנגישות: להשלים]. מייל: trywhatspoppin@gmail.com. אפשר לפנות גם בעמוד "צרו קשר".</w:t>
       </w:r>
     </w:p>
     <w:p>
@@ -12864,7 +12864,7 @@
           <w:rtl w:val="1"/>
           <w:szCs w:val="22"/>
         </w:rPr>
-        <w:t>זהות החברה: הפלטפורמה מופעלת על ידי איל חדידה כעוסק. האם צריך להציג במסמכים מספר עוסק וכתובת? האם הסוג (פטור או מורשה) משנה משהו בניסוח, למשל בנושא מע"מ?</w:t>
+        <w:t>זהות המפעיל: הפלטפורמה מופעלת על ידי עוסק יחיד, וכרגע שמו, מספר העוסק והכתובת לא מוצגים באתר. האם חובה להציג אותם (למשל לפי חוק הגנת הצרכן לגבי מפרסמים שמשלמים, או בהצהרת הנגישות)? האם הסוג (פטור או מורשה) משנה משהו בניסוח, למשל בנושא מע"מ?</w:t>
       </w:r>
     </w:p>
     <w:p>

</xml_diff>